<commit_message>
Ajusta dados e layout de Diárias
</commit_message>
<xml_diff>
--- a/modelos/modelo_requerimento_meia.docx
+++ b/modelos/modelo_requerimento_meia.docx
@@ -831,7 +831,7 @@
           <w:sz w:val="22"/>
           <w:szCs w:val="22"/>
         </w:rPr>
-        <w:t>{{{</w:t>
+        <w:t>{{{horario_ida}}}</w:t>
       </w:r>
       <w:proofErr w:type="spellStart"/>
       <w:r>
@@ -839,7 +839,7 @@
           <w:sz w:val="22"/>
           <w:szCs w:val="22"/>
         </w:rPr>
-        <w:t>horário_ida</w:t>
+        <w:t/>
       </w:r>
       <w:proofErr w:type="spellEnd"/>
       <w:r>
@@ -847,7 +847,7 @@
           <w:sz w:val="22"/>
           <w:szCs w:val="22"/>
         </w:rPr>
-        <w:t>}}}</w:t>
+        <w:t/>
       </w:r>
       <w:r>
         <w:rPr>

</xml_diff>